<commit_message>
ek ilaç eklendi hasta kontrolünde bakıcı pdf olarak çıktı alabiliyor artık
</commit_message>
<xml_diff>
--- a/Dökümantasyon/YMGK_NefesiSaati.docx
+++ b/Dökümantasyon/YMGK_NefesiSaati.docx
@@ -222,15 +222,8 @@
           <w14:ligatures w14:val="none"/>
         </w:rPr>
       </w:pPr>
-      <w:r>
-        <w:rPr>
-          <w:rFonts w:ascii="Times New Roman" w:eastAsia="Times New Roman" w:hAnsi="Times New Roman" w:cs="Times New Roman"/>
-          <w:kern w:val="0"/>
-          <w:lang w:eastAsia="tr-TR"/>
-          <w14:ligatures w14:val="none"/>
-        </w:rPr>
-        <w:t>Takım Adı : Nefes Saati</w:t>
-      </w:r>
+      <w:bookmarkStart w:id="0" w:name="_GoBack"/>
+      <w:bookmarkEnd w:id="0"/>
       <w:r>
         <w:rPr>
           <w:rFonts w:ascii="Times New Roman" w:eastAsia="Times New Roman" w:hAnsi="Times New Roman" w:cs="Times New Roman"/>
@@ -3504,16 +3497,7 @@
           <w14:ligatures w14:val="none"/>
         </w:rPr>
         <w:br/>
-        <w:t xml:space="preserve">2. </w:t>
-      </w:r>
-      <w:r>
-        <w:rPr>
-          <w:rFonts w:ascii="Times New Roman" w:eastAsia="Times New Roman" w:hAnsi="Times New Roman" w:cs="Times New Roman"/>
-          <w:kern w:val="0"/>
-          <w:lang w:eastAsia="tr-TR"/>
-          <w14:ligatures w14:val="none"/>
-        </w:rPr>
-        <w:t xml:space="preserve">Bakıcıya Otomatik </w:t>
+        <w:t xml:space="preserve">2. Bakıcıya Otomatik </w:t>
       </w:r>
       <w:proofErr w:type="spellStart"/>
       <w:r>
@@ -3577,16 +3561,7 @@
                 <w:lang w:eastAsia="tr-TR"/>
                 <w14:ligatures w14:val="none"/>
               </w:rPr>
-              <w:t>3.</w:t>
-            </w:r>
-            <w:r>
-              <w:rPr>
-                <w:rFonts w:ascii="Times New Roman" w:eastAsia="Times New Roman" w:hAnsi="Times New Roman" w:cs="Times New Roman"/>
-                <w:kern w:val="0"/>
-                <w:lang w:eastAsia="tr-TR"/>
-                <w14:ligatures w14:val="none"/>
-              </w:rPr>
-              <w:t xml:space="preserve">Yeni İlaç Ekleme </w:t>
+              <w:t xml:space="preserve">3.Yeni İlaç Ekleme </w:t>
             </w:r>
             <w:proofErr w:type="spellStart"/>
             <w:r>
@@ -3647,16 +3622,7 @@
                 <w:lang w:eastAsia="tr-TR"/>
                 <w14:ligatures w14:val="none"/>
               </w:rPr>
-              <w:t>4.</w:t>
-            </w:r>
-            <w:r>
-              <w:rPr>
-                <w:rFonts w:ascii="Times New Roman" w:eastAsia="Times New Roman" w:hAnsi="Times New Roman" w:cs="Times New Roman"/>
-                <w:kern w:val="0"/>
-                <w:lang w:eastAsia="tr-TR"/>
-                <w14:ligatures w14:val="none"/>
-              </w:rPr>
-              <w:t xml:space="preserve">Doktor Raporu PDF </w:t>
+              <w:t xml:space="preserve">4.Doktor Raporu PDF </w:t>
             </w:r>
             <w:proofErr w:type="spellStart"/>
             <w:r>
@@ -3678,8 +3644,6 @@
               </w:rPr>
               <w:t>: Son 30 günlük doz geçmişinin PDF çıktısı; doktor ziyaretlerinde kullanım için.</w:t>
             </w:r>
-            <w:bookmarkStart w:id="0" w:name="_GoBack"/>
-            <w:bookmarkEnd w:id="0"/>
           </w:p>
         </w:tc>
       </w:tr>
@@ -5108,7 +5072,7 @@
 </file>
 
 <file path=customXml/itemProps1.xml><?xml version="1.0" encoding="utf-8"?>
-<ds:datastoreItem xmlns:ds="http://schemas.openxmlformats.org/officeDocument/2006/customXml" ds:itemID="{C4EC8F3F-B36A-445A-B308-B97E667C1910}">
+<ds:datastoreItem xmlns:ds="http://schemas.openxmlformats.org/officeDocument/2006/customXml" ds:itemID="{273B14CF-94BB-4D27-9554-A67D2E9D43D8}">
   <ds:schemaRefs>
     <ds:schemaRef ds:uri="http://schemas.openxmlformats.org/officeDocument/2006/bibliography"/>
   </ds:schemaRefs>

</xml_diff>